<commit_message>
feat(dossier): activate full PDF/XLS export & MB Bank international wire transfer card generator and clipboard copy
</commit_message>
<xml_diff>
--- a/public/artifacts/HO_SO_XUAT_KHAU_THONG_QUAN_GSSDIX_FCA_269901/04_VAN_TAI_KHO_BAI_VINH_THANH/05_HUONG_DAN_NHAN_SU_AP_TAI_VA_LAI_XE_GSS_VINH_THANH.docx
+++ b/public/artifacts/HO_SO_XUAT_KHAU_THONG_QUAN_GSSDIX_FCA_269901/04_VAN_TAI_KHO_BAI_VINH_THANH/05_HUONG_DAN_NHAN_SU_AP_TAI_VA_LAI_XE_GSS_VINH_THANH.docx
@@ -58,7 +58,7 @@
       <w:r>
         <w:t>Mã văn bản: SOP-HD-269901-VT/GSS  |  Ngày ban hành: 17/09/2026</w:t>
         <w:br/>
-        <w:t>Áp dụng cho chuyến vận tải ngày 20/09/2026 (Phú Thọ) ➔ 21/09/2026 (Cửa khẩu Lao Bảo)</w:t>
+        <w:t>Áp dụng cho chuyến vận tải ngày 20/09/2026 (Phú Thọ) —&gt; 21/09/2026 (Cửa khẩu Lao Bảo)</w:t>
         <w:br/>
         <w:t>Đoàn phương tiện: HOWO MAX 74H-025.83 + Rơ-moóc 15.6m 74R-009.89 | Lái xe: LÊ VĂN THÔNG</w:t>
       </w:r>
@@ -926,7 +926,7 @@
                 <w:b/>
                 <w:sz w:val="18"/>
               </w:rPr>
-              <w:t>12h00 19/09 ➔</w:t>
+              <w:t>12h00 19/09 —&gt;</w:t>
               <w:br/>
               <w:t>06h00 20/09/2026</w:t>
             </w:r>
@@ -952,9 +952,9 @@
                 <w:rFonts w:ascii="Times New Roman" w:hAnsi="Times New Roman"/>
                 <w:sz w:val="18"/>
               </w:rPr>
-              <w:t>Phú Thọ ➔ QL1A ➔</w:t>
+              <w:t>Phú Thọ —&gt; QL1A —&gt;</w:t>
               <w:br/>
-              <w:t>Đường 9 ➔ Lao Bảo</w:t>
+              <w:t>Đường 9 —&gt; Lao Bảo</w:t>
             </w:r>
           </w:p>
         </w:tc>
@@ -1092,7 +1092,7 @@
               </w:rPr>
               <w:t>Giám sát G-SS</w:t>
               <w:br/>
-              <w:t>➔ Anh Nguyễn Miên</w:t>
+              <w:t>—&gt; Anh Nguyễn Miên</w:t>
             </w:r>
           </w:p>
         </w:tc>
@@ -1256,7 +1256,7 @@
           <w:color w:val="475569"/>
           <w:sz w:val="18"/>
         </w:rPr>
-        <w:t>Hình 1: Mô hình 4 bước nghiệp vụ thực địa: Đo kiểm xe ➔ Xếp &amp; Buộc đai ➔ Phủ bạt kẹp chì ➔ Sang hàng tại Lao Bảo</w:t>
+        <w:t>Hình 1: Mô hình 4 bước nghiệp vụ thực địa: Đo kiểm xe —&gt; Xếp &amp; Buộc đai —&gt; Phủ bạt kẹp chì —&gt; Sang hàng tại Lao Bảo</w:t>
       </w:r>
     </w:p>
     <w:p>
@@ -1478,7 +1478,7 @@
         <w:spacing w:before="200" w:after="60"/>
       </w:pPr>
       <w:r>
-        <w:t>2. Nhiệm vụ điều phối trong hành trình xe chạy (20/09 ➔ 21/09/2026):</w:t>
+        <w:t>2. Nhiệm vụ điều phối trong hành trình xe chạy (20/09 —&gt; 21/09/2026):</w:t>
       </w:r>
     </w:p>
     <w:p>

</xml_diff>